<commit_message>
smooth and normalize audio
</commit_message>
<xml_diff>
--- a/background_speech_script.docx
+++ b/background_speech_script.docx
@@ -462,6 +462,11 @@
     </w:p>
     <w:p>
       <w:pPr>
+        <w:pStyle w:val="ListParagraph"/>
+        <w:numPr>
+          <w:ilvl w:val="0"/>
+          <w:numId w:val="3"/>
+        </w:numPr>
         <w:spacing w:after="0" w:line="240" w:lineRule="auto"/>
         <w:rPr>
           <w:rFonts w:ascii="Times New Roman" w:eastAsia="Times New Roman" w:hAnsi="Times New Roman" w:cs="Times New Roman"/>
@@ -516,6 +521,11 @@
     </w:p>
     <w:p>
       <w:pPr>
+        <w:pStyle w:val="ListParagraph"/>
+        <w:numPr>
+          <w:ilvl w:val="0"/>
+          <w:numId w:val="3"/>
+        </w:numPr>
         <w:spacing w:after="0" w:line="240" w:lineRule="auto"/>
         <w:rPr>
           <w:rFonts w:ascii="Times New Roman" w:eastAsia="Times New Roman" w:hAnsi="Times New Roman" w:cs="Times New Roman"/>
@@ -538,6 +548,11 @@
     </w:p>
     <w:p>
       <w:pPr>
+        <w:pStyle w:val="ListParagraph"/>
+        <w:numPr>
+          <w:ilvl w:val="0"/>
+          <w:numId w:val="3"/>
+        </w:numPr>
         <w:spacing w:after="0" w:line="240" w:lineRule="auto"/>
         <w:rPr>
           <w:rFonts w:ascii="Times New Roman" w:eastAsia="Times New Roman" w:hAnsi="Times New Roman" w:cs="Times New Roman"/>
@@ -560,6 +575,11 @@
     </w:p>
     <w:p>
       <w:pPr>
+        <w:pStyle w:val="ListParagraph"/>
+        <w:numPr>
+          <w:ilvl w:val="0"/>
+          <w:numId w:val="3"/>
+        </w:numPr>
         <w:spacing w:after="0" w:line="240" w:lineRule="auto"/>
         <w:rPr>
           <w:rFonts w:ascii="Times New Roman" w:eastAsia="Times New Roman" w:hAnsi="Times New Roman" w:cs="Times New Roman"/>
@@ -582,6 +602,11 @@
     </w:p>
     <w:p>
       <w:pPr>
+        <w:pStyle w:val="ListParagraph"/>
+        <w:numPr>
+          <w:ilvl w:val="0"/>
+          <w:numId w:val="3"/>
+        </w:numPr>
         <w:spacing w:after="0" w:line="240" w:lineRule="auto"/>
         <w:rPr>
           <w:rFonts w:ascii="Times New Roman" w:eastAsia="Times New Roman" w:hAnsi="Times New Roman" w:cs="Times New Roman"/>
@@ -652,6 +677,11 @@
     </w:p>
     <w:p>
       <w:pPr>
+        <w:pStyle w:val="ListParagraph"/>
+        <w:numPr>
+          <w:ilvl w:val="0"/>
+          <w:numId w:val="3"/>
+        </w:numPr>
         <w:spacing w:after="0" w:line="240" w:lineRule="auto"/>
         <w:rPr>
           <w:rFonts w:ascii="Times New Roman" w:eastAsia="Times New Roman" w:hAnsi="Times New Roman" w:cs="Times New Roman"/>
@@ -675,6 +705,11 @@
     </w:p>
     <w:p>
       <w:pPr>
+        <w:pStyle w:val="ListParagraph"/>
+        <w:numPr>
+          <w:ilvl w:val="0"/>
+          <w:numId w:val="3"/>
+        </w:numPr>
         <w:spacing w:after="0" w:line="240" w:lineRule="auto"/>
         <w:rPr>
           <w:rFonts w:ascii="Times New Roman" w:eastAsia="Times New Roman" w:hAnsi="Times New Roman" w:cs="Times New Roman"/>
@@ -707,6 +742,11 @@
     </w:p>
     <w:p>
       <w:pPr>
+        <w:pStyle w:val="ListParagraph"/>
+        <w:numPr>
+          <w:ilvl w:val="0"/>
+          <w:numId w:val="3"/>
+        </w:numPr>
         <w:spacing w:after="0" w:line="240" w:lineRule="auto"/>
         <w:rPr>
           <w:rFonts w:ascii="Times New Roman" w:eastAsia="Times New Roman" w:hAnsi="Times New Roman" w:cs="Times New Roman"/>
@@ -729,6 +769,11 @@
     </w:p>
     <w:p>
       <w:pPr>
+        <w:pStyle w:val="ListParagraph"/>
+        <w:numPr>
+          <w:ilvl w:val="0"/>
+          <w:numId w:val="3"/>
+        </w:numPr>
         <w:spacing w:after="0" w:line="240" w:lineRule="auto"/>
         <w:rPr>
           <w:rFonts w:ascii="Times New Roman" w:eastAsia="Times New Roman" w:hAnsi="Times New Roman" w:cs="Times New Roman"/>
@@ -751,6 +796,11 @@
     </w:p>
     <w:p>
       <w:pPr>
+        <w:pStyle w:val="ListParagraph"/>
+        <w:numPr>
+          <w:ilvl w:val="0"/>
+          <w:numId w:val="3"/>
+        </w:numPr>
         <w:spacing w:after="0" w:line="240" w:lineRule="auto"/>
         <w:rPr>
           <w:rFonts w:ascii="Times New Roman" w:eastAsia="Times New Roman" w:hAnsi="Times New Roman" w:cs="Times New Roman"/>
@@ -773,6 +823,11 @@
     </w:p>
     <w:p>
       <w:pPr>
+        <w:pStyle w:val="ListParagraph"/>
+        <w:numPr>
+          <w:ilvl w:val="0"/>
+          <w:numId w:val="3"/>
+        </w:numPr>
         <w:spacing w:after="0" w:line="240" w:lineRule="auto"/>
         <w:rPr>
           <w:rFonts w:ascii="Times New Roman" w:eastAsia="Times New Roman" w:hAnsi="Times New Roman" w:cs="Times New Roman"/>
@@ -827,6 +882,11 @@
     </w:p>
     <w:p>
       <w:pPr>
+        <w:pStyle w:val="ListParagraph"/>
+        <w:numPr>
+          <w:ilvl w:val="0"/>
+          <w:numId w:val="3"/>
+        </w:numPr>
         <w:spacing w:after="0" w:line="240" w:lineRule="auto"/>
         <w:rPr>
           <w:rFonts w:ascii="Times New Roman" w:eastAsia="Times New Roman" w:hAnsi="Times New Roman" w:cs="Times New Roman"/>
@@ -872,6 +932,11 @@
     </w:p>
     <w:p>
       <w:pPr>
+        <w:pStyle w:val="ListParagraph"/>
+        <w:numPr>
+          <w:ilvl w:val="0"/>
+          <w:numId w:val="3"/>
+        </w:numPr>
         <w:spacing w:after="0" w:line="240" w:lineRule="auto"/>
         <w:rPr>
           <w:rFonts w:ascii="Times New Roman" w:eastAsia="Times New Roman" w:hAnsi="Times New Roman" w:cs="Times New Roman"/>
@@ -899,11 +964,38 @@
           <w:kern w:val="0"/>
           <w14:ligatures w14:val="none"/>
         </w:rPr>
-        <w:t xml:space="preserve"> sounds really fun!</w:t>
-      </w:r>
-    </w:p>
-    <w:p>
-      <w:pPr>
+        <w:t xml:space="preserve"> sounds </w:t>
+      </w:r>
+      <w:proofErr w:type="gramStart"/>
+      <w:r>
+        <w:rPr>
+          <w:rFonts w:ascii="Times New Roman" w:eastAsia="Times New Roman" w:hAnsi="Times New Roman" w:cs="Times New Roman"/>
+          <w:b/>
+          <w:bCs/>
+          <w:kern w:val="0"/>
+          <w14:ligatures w14:val="none"/>
+        </w:rPr>
+        <w:t>really fun</w:t>
+      </w:r>
+      <w:proofErr w:type="gramEnd"/>
+      <w:r>
+        <w:rPr>
+          <w:rFonts w:ascii="Times New Roman" w:eastAsia="Times New Roman" w:hAnsi="Times New Roman" w:cs="Times New Roman"/>
+          <w:b/>
+          <w:bCs/>
+          <w:kern w:val="0"/>
+          <w14:ligatures w14:val="none"/>
+        </w:rPr>
+        <w:t>!</w:t>
+      </w:r>
+    </w:p>
+    <w:p>
+      <w:pPr>
+        <w:pStyle w:val="ListParagraph"/>
+        <w:numPr>
+          <w:ilvl w:val="0"/>
+          <w:numId w:val="3"/>
+        </w:numPr>
         <w:spacing w:after="0" w:line="240" w:lineRule="auto"/>
         <w:rPr>
           <w:rFonts w:ascii="Times New Roman" w:eastAsia="Times New Roman" w:hAnsi="Times New Roman" w:cs="Times New Roman"/>
@@ -926,6 +1018,11 @@
     </w:p>
     <w:p>
       <w:pPr>
+        <w:pStyle w:val="ListParagraph"/>
+        <w:numPr>
+          <w:ilvl w:val="0"/>
+          <w:numId w:val="3"/>
+        </w:numPr>
         <w:spacing w:after="0" w:line="240" w:lineRule="auto"/>
         <w:rPr>
           <w:rFonts w:ascii="Times New Roman" w:eastAsia="Times New Roman" w:hAnsi="Times New Roman" w:cs="Times New Roman"/>
@@ -948,6 +1045,11 @@
     </w:p>
     <w:p>
       <w:pPr>
+        <w:pStyle w:val="ListParagraph"/>
+        <w:numPr>
+          <w:ilvl w:val="0"/>
+          <w:numId w:val="3"/>
+        </w:numPr>
         <w:spacing w:after="0" w:line="240" w:lineRule="auto"/>
         <w:rPr>
           <w:rFonts w:ascii="Times New Roman" w:eastAsia="Times New Roman" w:hAnsi="Times New Roman" w:cs="Times New Roman"/>
@@ -970,6 +1072,11 @@
     </w:p>
     <w:p>
       <w:pPr>
+        <w:pStyle w:val="ListParagraph"/>
+        <w:numPr>
+          <w:ilvl w:val="0"/>
+          <w:numId w:val="3"/>
+        </w:numPr>
         <w:spacing w:after="0" w:line="240" w:lineRule="auto"/>
         <w:rPr>
           <w:rFonts w:ascii="Times New Roman" w:eastAsia="Times New Roman" w:hAnsi="Times New Roman" w:cs="Times New Roman"/>
@@ -992,6 +1099,11 @@
     </w:p>
     <w:p>
       <w:pPr>
+        <w:pStyle w:val="ListParagraph"/>
+        <w:numPr>
+          <w:ilvl w:val="0"/>
+          <w:numId w:val="3"/>
+        </w:numPr>
         <w:spacing w:after="0" w:line="240" w:lineRule="auto"/>
         <w:rPr>
           <w:rFonts w:ascii="Times New Roman" w:eastAsia="Times New Roman" w:hAnsi="Times New Roman" w:cs="Times New Roman"/>
@@ -1015,6 +1127,11 @@
     </w:p>
     <w:p>
       <w:pPr>
+        <w:pStyle w:val="ListParagraph"/>
+        <w:numPr>
+          <w:ilvl w:val="0"/>
+          <w:numId w:val="3"/>
+        </w:numPr>
         <w:spacing w:after="0" w:line="240" w:lineRule="auto"/>
         <w:rPr>
           <w:rFonts w:ascii="Times New Roman" w:eastAsia="Times New Roman" w:hAnsi="Times New Roman" w:cs="Times New Roman"/>
@@ -1049,6 +1166,11 @@
     </w:p>
     <w:p>
       <w:pPr>
+        <w:pStyle w:val="ListParagraph"/>
+        <w:numPr>
+          <w:ilvl w:val="0"/>
+          <w:numId w:val="3"/>
+        </w:numPr>
         <w:spacing w:after="0" w:line="240" w:lineRule="auto"/>
         <w:rPr>
           <w:rFonts w:ascii="Times New Roman" w:eastAsia="Times New Roman" w:hAnsi="Times New Roman" w:cs="Times New Roman"/>
@@ -1083,11 +1205,17 @@
     </w:p>
     <w:p>
       <w:pPr>
-        <w:spacing w:after="0" w:line="240" w:lineRule="auto"/>
-        <w:rPr>
-          <w:rFonts w:ascii="Times New Roman" w:eastAsia="Times New Roman" w:hAnsi="Times New Roman" w:cs="Times New Roman"/>
-          <w:b/>
-          <w:bCs/>
+        <w:pStyle w:val="ListParagraph"/>
+        <w:numPr>
+          <w:ilvl w:val="0"/>
+          <w:numId w:val="3"/>
+        </w:numPr>
+        <w:spacing w:after="0" w:line="240" w:lineRule="auto"/>
+        <w:rPr>
+          <w:rFonts w:ascii="Times New Roman" w:eastAsia="Times New Roman" w:hAnsi="Times New Roman" w:cs="Times New Roman"/>
+          <w:b/>
+          <w:bCs/>
+          <w:strike/>
           <w:kern w:val="0"/>
           <w14:ligatures w14:val="none"/>
         </w:rPr>
@@ -1108,30 +1236,11 @@
     </w:p>
     <w:p>
       <w:pPr>
-        <w:spacing w:after="0" w:line="240" w:lineRule="auto"/>
-        <w:rPr>
-          <w:rFonts w:ascii="Times New Roman" w:eastAsia="Times New Roman" w:hAnsi="Times New Roman" w:cs="Times New Roman"/>
-          <w:b/>
-          <w:bCs/>
-          <w:strike/>
-          <w:kern w:val="0"/>
-          <w14:ligatures w14:val="none"/>
-        </w:rPr>
-      </w:pPr>
-      <w:r>
-        <w:rPr>
-          <w:rFonts w:ascii="Times New Roman" w:eastAsia="Times New Roman" w:hAnsi="Times New Roman" w:cs="Times New Roman"/>
-          <w:b/>
-          <w:bCs/>
-          <w:strike/>
-          <w:kern w:val="0"/>
-          <w14:ligatures w14:val="none"/>
-        </w:rPr>
-        <w:t>I should be done before lunchtime.</w:t>
-      </w:r>
-    </w:p>
-    <w:p>
-      <w:pPr>
+        <w:pStyle w:val="ListParagraph"/>
+        <w:numPr>
+          <w:ilvl w:val="0"/>
+          <w:numId w:val="3"/>
+        </w:numPr>
         <w:spacing w:after="0" w:line="240" w:lineRule="auto"/>
         <w:rPr>
           <w:rFonts w:ascii="Times New Roman" w:eastAsia="Times New Roman" w:hAnsi="Times New Roman" w:cs="Times New Roman"/>
@@ -2056,6 +2165,11 @@
     </w:p>
     <w:p>
       <w:pPr>
+        <w:pStyle w:val="ListParagraph"/>
+        <w:numPr>
+          <w:ilvl w:val="0"/>
+          <w:numId w:val="4"/>
+        </w:numPr>
         <w:spacing w:after="0" w:line="240" w:lineRule="auto"/>
         <w:rPr>
           <w:rFonts w:ascii="Times New Roman" w:eastAsia="Times New Roman" w:hAnsi="Times New Roman" w:cs="Times New Roman"/>
@@ -2075,6 +2189,11 @@
     </w:p>
     <w:p>
       <w:pPr>
+        <w:pStyle w:val="ListParagraph"/>
+        <w:numPr>
+          <w:ilvl w:val="0"/>
+          <w:numId w:val="4"/>
+        </w:numPr>
         <w:spacing w:after="0" w:line="240" w:lineRule="auto"/>
         <w:rPr>
           <w:rFonts w:ascii="Times New Roman" w:eastAsia="Times New Roman" w:hAnsi="Times New Roman" w:cs="Times New Roman"/>
@@ -2093,6 +2212,11 @@
     </w:p>
     <w:p>
       <w:pPr>
+        <w:pStyle w:val="ListParagraph"/>
+        <w:numPr>
+          <w:ilvl w:val="0"/>
+          <w:numId w:val="4"/>
+        </w:numPr>
         <w:spacing w:after="0" w:line="240" w:lineRule="auto"/>
         <w:rPr>
           <w:rFonts w:ascii="Times New Roman" w:eastAsia="Times New Roman" w:hAnsi="Times New Roman" w:cs="Times New Roman"/>
@@ -2111,6 +2235,11 @@
     </w:p>
     <w:p>
       <w:pPr>
+        <w:pStyle w:val="ListParagraph"/>
+        <w:numPr>
+          <w:ilvl w:val="0"/>
+          <w:numId w:val="4"/>
+        </w:numPr>
         <w:spacing w:after="0" w:line="240" w:lineRule="auto"/>
         <w:rPr>
           <w:rFonts w:ascii="Times New Roman" w:eastAsia="Times New Roman" w:hAnsi="Times New Roman" w:cs="Times New Roman"/>
@@ -2139,6 +2268,11 @@
     </w:p>
     <w:p>
       <w:pPr>
+        <w:pStyle w:val="ListParagraph"/>
+        <w:numPr>
+          <w:ilvl w:val="0"/>
+          <w:numId w:val="4"/>
+        </w:numPr>
         <w:spacing w:after="0" w:line="240" w:lineRule="auto"/>
         <w:rPr>
           <w:rFonts w:ascii="Times New Roman" w:eastAsia="Times New Roman" w:hAnsi="Times New Roman" w:cs="Times New Roman"/>
@@ -2157,6 +2291,11 @@
     </w:p>
     <w:p>
       <w:pPr>
+        <w:pStyle w:val="ListParagraph"/>
+        <w:numPr>
+          <w:ilvl w:val="0"/>
+          <w:numId w:val="4"/>
+        </w:numPr>
         <w:spacing w:after="0" w:line="240" w:lineRule="auto"/>
         <w:rPr>
           <w:rFonts w:ascii="Times New Roman" w:eastAsia="Times New Roman" w:hAnsi="Times New Roman" w:cs="Times New Roman"/>
@@ -2175,6 +2314,11 @@
     </w:p>
     <w:p>
       <w:pPr>
+        <w:pStyle w:val="ListParagraph"/>
+        <w:numPr>
+          <w:ilvl w:val="0"/>
+          <w:numId w:val="4"/>
+        </w:numPr>
         <w:spacing w:after="0" w:line="240" w:lineRule="auto"/>
         <w:rPr>
           <w:rFonts w:ascii="Times New Roman" w:eastAsia="Times New Roman" w:hAnsi="Times New Roman" w:cs="Times New Roman"/>
@@ -2193,6 +2337,11 @@
     </w:p>
     <w:p>
       <w:pPr>
+        <w:pStyle w:val="ListParagraph"/>
+        <w:numPr>
+          <w:ilvl w:val="0"/>
+          <w:numId w:val="4"/>
+        </w:numPr>
         <w:spacing w:after="0" w:line="240" w:lineRule="auto"/>
         <w:rPr>
           <w:rFonts w:ascii="Times New Roman" w:eastAsia="Times New Roman" w:hAnsi="Times New Roman" w:cs="Times New Roman"/>
@@ -2243,6 +2392,178 @@
 <file path=word/numbering.xml><?xml version="1.0" encoding="utf-8"?>
 <w:numbering xmlns:wpc="http://schemas.microsoft.com/office/word/2010/wordprocessingCanvas" xmlns:cx="http://schemas.microsoft.com/office/drawing/2014/chartex" xmlns:cx1="http://schemas.microsoft.com/office/drawing/2015/9/8/chartex" xmlns:cx2="http://schemas.microsoft.com/office/drawing/2015/10/21/chartex" xmlns:cx3="http://schemas.microsoft.com/office/drawing/2016/5/9/chartex" xmlns:cx4="http://schemas.microsoft.com/office/drawing/2016/5/10/chartex" xmlns:cx5="http://schemas.microsoft.com/office/drawing/2016/5/11/chartex" xmlns:cx6="http://schemas.microsoft.com/office/drawing/2016/5/12/chartex" xmlns:cx7="http://schemas.microsoft.com/office/drawing/2016/5/13/chartex" xmlns:cx8="http://schemas.microsoft.com/office/drawing/2016/5/14/chartex" xmlns:mc="http://schemas.openxmlformats.org/markup-compatibility/2006" xmlns:aink="http://schemas.microsoft.com/office/drawing/2016/ink" xmlns:am3d="http://schemas.microsoft.com/office/drawing/2017/model3d" xmlns:o="urn:schemas-microsoft-com:office:office" xmlns:oel="http://schemas.microsoft.com/office/2019/extlst" xmlns:r="http://schemas.openxmlformats.org/officeDocument/2006/relationships" xmlns:m="http://schemas.openxmlformats.org/officeDocument/2006/math" xmlns:v="urn:schemas-microsoft-com:vml" xmlns:wp14="http://schemas.microsoft.com/office/word/2010/wordprocessingDrawing" xmlns:wp="http://schemas.openxmlformats.org/drawingml/2006/wordprocessingDrawing" xmlns:w10="urn:schemas-microsoft-com:office:word" xmlns:w="http://schemas.openxmlformats.org/wordprocessingml/2006/main" xmlns:w14="http://schemas.microsoft.com/office/word/2010/wordml" xmlns:w15="http://schemas.microsoft.com/office/word/2012/wordml" xmlns:w16cex="http://schemas.microsoft.com/office/word/2018/wordml/cex" xmlns:w16cid="http://schemas.microsoft.com/office/word/2016/wordml/cid" xmlns:w16="http://schemas.microsoft.com/office/word/2018/wordml" xmlns:w16du="http://schemas.microsoft.com/office/word/2023/wordml/word16du" xmlns:w16sdtdh="http://schemas.microsoft.com/office/word/2020/wordml/sdtdatahash" xmlns:w16sdtfl="http://schemas.microsoft.com/office/word/2024/wordml/sdtformatlock" xmlns:w16se="http://schemas.microsoft.com/office/word/2015/wordml/symex" xmlns:wpg="http://schemas.microsoft.com/office/word/2010/wordprocessingGroup" xmlns:wpi="http://schemas.microsoft.com/office/word/2010/wordprocessingInk" xmlns:wne="http://schemas.microsoft.com/office/word/2006/wordml" xmlns:wps="http://schemas.microsoft.com/office/word/2010/wordprocessingShape" mc:Ignorable="w14 w15 w16se w16cid w16 w16cex w16sdtdh w16sdtfl w16du wp14">
   <w:abstractNum w:abstractNumId="0" w15:restartNumberingAfterBreak="0">
+    <w:nsid w:val="32896BA7"/>
+    <w:multiLevelType w:val="hybridMultilevel"/>
+    <w:tmpl w:val="5FF49CA4"/>
+    <w:lvl w:ilvl="0" w:tplc="0409000F">
+      <w:start w:val="1"/>
+      <w:numFmt w:val="decimal"/>
+      <w:lvlText w:val="%1."/>
+      <w:lvlJc w:val="left"/>
+      <w:pPr>
+        <w:ind w:left="720" w:hanging="360"/>
+      </w:pPr>
+    </w:lvl>
+    <w:lvl w:ilvl="1" w:tplc="04090019" w:tentative="1">
+      <w:start w:val="1"/>
+      <w:numFmt w:val="lowerLetter"/>
+      <w:lvlText w:val="%2."/>
+      <w:lvlJc w:val="left"/>
+      <w:pPr>
+        <w:ind w:left="1440" w:hanging="360"/>
+      </w:pPr>
+    </w:lvl>
+    <w:lvl w:ilvl="2" w:tplc="0409001B" w:tentative="1">
+      <w:start w:val="1"/>
+      <w:numFmt w:val="lowerRoman"/>
+      <w:lvlText w:val="%3."/>
+      <w:lvlJc w:val="right"/>
+      <w:pPr>
+        <w:ind w:left="2160" w:hanging="180"/>
+      </w:pPr>
+    </w:lvl>
+    <w:lvl w:ilvl="3" w:tplc="0409000F" w:tentative="1">
+      <w:start w:val="1"/>
+      <w:numFmt w:val="decimal"/>
+      <w:lvlText w:val="%4."/>
+      <w:lvlJc w:val="left"/>
+      <w:pPr>
+        <w:ind w:left="2880" w:hanging="360"/>
+      </w:pPr>
+    </w:lvl>
+    <w:lvl w:ilvl="4" w:tplc="04090019" w:tentative="1">
+      <w:start w:val="1"/>
+      <w:numFmt w:val="lowerLetter"/>
+      <w:lvlText w:val="%5."/>
+      <w:lvlJc w:val="left"/>
+      <w:pPr>
+        <w:ind w:left="3600" w:hanging="360"/>
+      </w:pPr>
+    </w:lvl>
+    <w:lvl w:ilvl="5" w:tplc="0409001B" w:tentative="1">
+      <w:start w:val="1"/>
+      <w:numFmt w:val="lowerRoman"/>
+      <w:lvlText w:val="%6."/>
+      <w:lvlJc w:val="right"/>
+      <w:pPr>
+        <w:ind w:left="4320" w:hanging="180"/>
+      </w:pPr>
+    </w:lvl>
+    <w:lvl w:ilvl="6" w:tplc="0409000F" w:tentative="1">
+      <w:start w:val="1"/>
+      <w:numFmt w:val="decimal"/>
+      <w:lvlText w:val="%7."/>
+      <w:lvlJc w:val="left"/>
+      <w:pPr>
+        <w:ind w:left="5040" w:hanging="360"/>
+      </w:pPr>
+    </w:lvl>
+    <w:lvl w:ilvl="7" w:tplc="04090019" w:tentative="1">
+      <w:start w:val="1"/>
+      <w:numFmt w:val="lowerLetter"/>
+      <w:lvlText w:val="%8."/>
+      <w:lvlJc w:val="left"/>
+      <w:pPr>
+        <w:ind w:left="5760" w:hanging="360"/>
+      </w:pPr>
+    </w:lvl>
+    <w:lvl w:ilvl="8" w:tplc="0409001B" w:tentative="1">
+      <w:start w:val="1"/>
+      <w:numFmt w:val="lowerRoman"/>
+      <w:lvlText w:val="%9."/>
+      <w:lvlJc w:val="right"/>
+      <w:pPr>
+        <w:ind w:left="6480" w:hanging="180"/>
+      </w:pPr>
+    </w:lvl>
+  </w:abstractNum>
+  <w:abstractNum w:abstractNumId="1" w15:restartNumberingAfterBreak="0">
+    <w:nsid w:val="48B33C2B"/>
+    <w:multiLevelType w:val="hybridMultilevel"/>
+    <w:tmpl w:val="D902BACE"/>
+    <w:lvl w:ilvl="0" w:tplc="0409000F">
+      <w:start w:val="1"/>
+      <w:numFmt w:val="decimal"/>
+      <w:lvlText w:val="%1."/>
+      <w:lvlJc w:val="left"/>
+      <w:pPr>
+        <w:ind w:left="720" w:hanging="360"/>
+      </w:pPr>
+    </w:lvl>
+    <w:lvl w:ilvl="1" w:tplc="04090019" w:tentative="1">
+      <w:start w:val="1"/>
+      <w:numFmt w:val="lowerLetter"/>
+      <w:lvlText w:val="%2."/>
+      <w:lvlJc w:val="left"/>
+      <w:pPr>
+        <w:ind w:left="1440" w:hanging="360"/>
+      </w:pPr>
+    </w:lvl>
+    <w:lvl w:ilvl="2" w:tplc="0409001B" w:tentative="1">
+      <w:start w:val="1"/>
+      <w:numFmt w:val="lowerRoman"/>
+      <w:lvlText w:val="%3."/>
+      <w:lvlJc w:val="right"/>
+      <w:pPr>
+        <w:ind w:left="2160" w:hanging="180"/>
+      </w:pPr>
+    </w:lvl>
+    <w:lvl w:ilvl="3" w:tplc="0409000F" w:tentative="1">
+      <w:start w:val="1"/>
+      <w:numFmt w:val="decimal"/>
+      <w:lvlText w:val="%4."/>
+      <w:lvlJc w:val="left"/>
+      <w:pPr>
+        <w:ind w:left="2880" w:hanging="360"/>
+      </w:pPr>
+    </w:lvl>
+    <w:lvl w:ilvl="4" w:tplc="04090019" w:tentative="1">
+      <w:start w:val="1"/>
+      <w:numFmt w:val="lowerLetter"/>
+      <w:lvlText w:val="%5."/>
+      <w:lvlJc w:val="left"/>
+      <w:pPr>
+        <w:ind w:left="3600" w:hanging="360"/>
+      </w:pPr>
+    </w:lvl>
+    <w:lvl w:ilvl="5" w:tplc="0409001B" w:tentative="1">
+      <w:start w:val="1"/>
+      <w:numFmt w:val="lowerRoman"/>
+      <w:lvlText w:val="%6."/>
+      <w:lvlJc w:val="right"/>
+      <w:pPr>
+        <w:ind w:left="4320" w:hanging="180"/>
+      </w:pPr>
+    </w:lvl>
+    <w:lvl w:ilvl="6" w:tplc="0409000F" w:tentative="1">
+      <w:start w:val="1"/>
+      <w:numFmt w:val="decimal"/>
+      <w:lvlText w:val="%7."/>
+      <w:lvlJc w:val="left"/>
+      <w:pPr>
+        <w:ind w:left="5040" w:hanging="360"/>
+      </w:pPr>
+    </w:lvl>
+    <w:lvl w:ilvl="7" w:tplc="04090019" w:tentative="1">
+      <w:start w:val="1"/>
+      <w:numFmt w:val="lowerLetter"/>
+      <w:lvlText w:val="%8."/>
+      <w:lvlJc w:val="left"/>
+      <w:pPr>
+        <w:ind w:left="5760" w:hanging="360"/>
+      </w:pPr>
+    </w:lvl>
+    <w:lvl w:ilvl="8" w:tplc="0409001B" w:tentative="1">
+      <w:start w:val="1"/>
+      <w:numFmt w:val="lowerRoman"/>
+      <w:lvlText w:val="%9."/>
+      <w:lvlJc w:val="right"/>
+      <w:pPr>
+        <w:ind w:left="6480" w:hanging="180"/>
+      </w:pPr>
+    </w:lvl>
+  </w:abstractNum>
+  <w:abstractNum w:abstractNumId="2" w15:restartNumberingAfterBreak="0">
     <w:nsid w:val="650A0DBF"/>
     <w:multiLevelType w:val="hybridMultilevel"/>
     <w:tmpl w:val="304C2A92"/>
@@ -2328,7 +2649,7 @@
       </w:pPr>
     </w:lvl>
   </w:abstractNum>
-  <w:abstractNum w:abstractNumId="1" w15:restartNumberingAfterBreak="0">
+  <w:abstractNum w:abstractNumId="3" w15:restartNumberingAfterBreak="0">
     <w:nsid w:val="764D2D98"/>
     <w:multiLevelType w:val="hybridMultilevel"/>
     <w:tmpl w:val="A83A602E"/>
@@ -2415,10 +2736,16 @@
     </w:lvl>
   </w:abstractNum>
   <w:num w:numId="1" w16cid:durableId="1407998767">
-    <w:abstractNumId w:val="0"/>
+    <w:abstractNumId w:val="2"/>
   </w:num>
   <w:num w:numId="2" w16cid:durableId="2133476742">
+    <w:abstractNumId w:val="3"/>
+  </w:num>
+  <w:num w:numId="3" w16cid:durableId="934244134">
     <w:abstractNumId w:val="1"/>
+  </w:num>
+  <w:num w:numId="4" w16cid:durableId="2123453343">
+    <w:abstractNumId w:val="0"/>
   </w:num>
 </w:numbering>
 </file>

</xml_diff>